<commit_message>
actualizacion de avances esteban
</commit_message>
<xml_diff>
--- a/Formularios LOGT/Esteban de la Peña.docx
+++ b/Formularios LOGT/Esteban de la Peña.docx
@@ -267,6 +267,350 @@
               <w:t>Comentarios</w:t>
             </w:r>
             <w:proofErr w:type="spellEnd"/>
+          </w:p>
+        </w:tc>
+      </w:tr>
+      <w:tr>
+        <w:trPr>
+          <w:trHeight w:val="230"/>
+        </w:trPr>
+        <w:tc>
+          <w:tcPr>
+            <w:tcW w:w="0" w:type="auto"/>
+            <w:tcBorders>
+              <w:top w:val="single" w:sz="4" w:space="0" w:color="000000"/>
+              <w:left w:val="single" w:sz="4" w:space="0" w:color="000000"/>
+              <w:bottom w:val="single" w:sz="4" w:space="0" w:color="000000"/>
+              <w:right w:val="single" w:sz="4" w:space="0" w:color="000000"/>
+            </w:tcBorders>
+            <w:tcMar>
+              <w:top w:w="100" w:type="dxa"/>
+              <w:left w:w="100" w:type="dxa"/>
+              <w:bottom w:w="100" w:type="dxa"/>
+              <w:right w:w="100" w:type="dxa"/>
+            </w:tcMar>
+          </w:tcPr>
+          <w:p>
+            <w:r>
+              <w:t>25/02</w:t>
+            </w:r>
+          </w:p>
+        </w:tc>
+        <w:tc>
+          <w:tcPr>
+            <w:tcW w:w="0" w:type="auto"/>
+            <w:tcBorders>
+              <w:top w:val="single" w:sz="4" w:space="0" w:color="000000"/>
+              <w:left w:val="single" w:sz="4" w:space="0" w:color="000000"/>
+              <w:bottom w:val="single" w:sz="4" w:space="0" w:color="000000"/>
+              <w:right w:val="single" w:sz="4" w:space="0" w:color="000000"/>
+            </w:tcBorders>
+            <w:tcMar>
+              <w:top w:w="100" w:type="dxa"/>
+              <w:left w:w="100" w:type="dxa"/>
+              <w:bottom w:w="100" w:type="dxa"/>
+              <w:right w:w="100" w:type="dxa"/>
+            </w:tcMar>
+          </w:tcPr>
+          <w:p>
+            <w:r>
+              <w:t>5:30</w:t>
+            </w:r>
+          </w:p>
+        </w:tc>
+        <w:tc>
+          <w:tcPr>
+            <w:tcW w:w="0" w:type="auto"/>
+            <w:tcBorders>
+              <w:top w:val="single" w:sz="4" w:space="0" w:color="000000"/>
+              <w:left w:val="single" w:sz="4" w:space="0" w:color="000000"/>
+              <w:bottom w:val="single" w:sz="4" w:space="0" w:color="000000"/>
+              <w:right w:val="single" w:sz="4" w:space="0" w:color="000000"/>
+            </w:tcBorders>
+            <w:tcMar>
+              <w:top w:w="100" w:type="dxa"/>
+              <w:left w:w="100" w:type="dxa"/>
+              <w:bottom w:w="100" w:type="dxa"/>
+              <w:right w:w="100" w:type="dxa"/>
+            </w:tcMar>
+          </w:tcPr>
+          <w:p>
+            <w:r>
+              <w:t>6:30</w:t>
+            </w:r>
+          </w:p>
+        </w:tc>
+        <w:tc>
+          <w:tcPr>
+            <w:tcW w:w="0" w:type="auto"/>
+            <w:tcBorders>
+              <w:top w:val="single" w:sz="4" w:space="0" w:color="000000"/>
+              <w:left w:val="single" w:sz="4" w:space="0" w:color="000000"/>
+              <w:bottom w:val="single" w:sz="4" w:space="0" w:color="000000"/>
+              <w:right w:val="single" w:sz="4" w:space="0" w:color="000000"/>
+            </w:tcBorders>
+            <w:tcMar>
+              <w:top w:w="100" w:type="dxa"/>
+              <w:left w:w="100" w:type="dxa"/>
+              <w:bottom w:w="100" w:type="dxa"/>
+              <w:right w:w="100" w:type="dxa"/>
+            </w:tcMar>
+          </w:tcPr>
+          <w:p/>
+        </w:tc>
+        <w:tc>
+          <w:tcPr>
+            <w:tcW w:w="0" w:type="auto"/>
+            <w:tcBorders>
+              <w:top w:val="single" w:sz="4" w:space="0" w:color="000000"/>
+              <w:left w:val="single" w:sz="4" w:space="0" w:color="000000"/>
+              <w:bottom w:val="single" w:sz="4" w:space="0" w:color="000000"/>
+              <w:right w:val="single" w:sz="4" w:space="0" w:color="000000"/>
+            </w:tcBorders>
+            <w:tcMar>
+              <w:top w:w="100" w:type="dxa"/>
+              <w:left w:w="100" w:type="dxa"/>
+              <w:bottom w:w="100" w:type="dxa"/>
+              <w:right w:w="100" w:type="dxa"/>
+            </w:tcMar>
+          </w:tcPr>
+          <w:p>
+            <w:r>
+              <w:t xml:space="preserve">60 </w:t>
+            </w:r>
+            <w:proofErr w:type="spellStart"/>
+            <w:r>
+              <w:t>minutos</w:t>
+            </w:r>
+            <w:proofErr w:type="spellEnd"/>
+          </w:p>
+        </w:tc>
+        <w:tc>
+          <w:tcPr>
+            <w:tcW w:w="0" w:type="auto"/>
+            <w:tcBorders>
+              <w:top w:val="single" w:sz="4" w:space="0" w:color="000000"/>
+              <w:left w:val="single" w:sz="4" w:space="0" w:color="000000"/>
+              <w:bottom w:val="single" w:sz="4" w:space="0" w:color="000000"/>
+              <w:right w:val="single" w:sz="4" w:space="0" w:color="000000"/>
+            </w:tcBorders>
+            <w:tcMar>
+              <w:top w:w="100" w:type="dxa"/>
+              <w:left w:w="100" w:type="dxa"/>
+              <w:bottom w:w="100" w:type="dxa"/>
+              <w:right w:w="100" w:type="dxa"/>
+            </w:tcMar>
+          </w:tcPr>
+          <w:p/>
+        </w:tc>
+        <w:tc>
+          <w:tcPr>
+            <w:tcW w:w="0" w:type="auto"/>
+            <w:tcBorders>
+              <w:top w:val="single" w:sz="4" w:space="0" w:color="000000"/>
+              <w:left w:val="single" w:sz="4" w:space="0" w:color="000000"/>
+              <w:bottom w:val="single" w:sz="4" w:space="0" w:color="000000"/>
+              <w:right w:val="single" w:sz="4" w:space="0" w:color="000000"/>
+            </w:tcBorders>
+            <w:tcMar>
+              <w:top w:w="100" w:type="dxa"/>
+              <w:left w:w="100" w:type="dxa"/>
+              <w:bottom w:w="100" w:type="dxa"/>
+              <w:right w:w="100" w:type="dxa"/>
+            </w:tcMar>
+          </w:tcPr>
+          <w:p>
+            <w:pPr>
+              <w:rPr>
+                <w:lang w:val="af-ZA"/>
+              </w:rPr>
+            </w:pPr>
+            <w:proofErr w:type="spellStart"/>
+            <w:r>
+              <w:rPr>
+                <w:lang w:val="es-GT"/>
+              </w:rPr>
+              <w:t>Redefinici</w:t>
+            </w:r>
+            <w:proofErr w:type="spellEnd"/>
+            <w:r>
+              <w:rPr>
+                <w:lang w:val="af-ZA"/>
+              </w:rPr>
+              <w:t>ón del listado de tareas por hacer, dividad por integrante y trabajo</w:t>
+            </w:r>
+          </w:p>
+        </w:tc>
+      </w:tr>
+      <w:tr>
+        <w:trPr>
+          <w:trHeight w:val="230"/>
+        </w:trPr>
+        <w:tc>
+          <w:tcPr>
+            <w:tcW w:w="0" w:type="auto"/>
+            <w:tcBorders>
+              <w:top w:val="single" w:sz="4" w:space="0" w:color="000000"/>
+              <w:left w:val="single" w:sz="4" w:space="0" w:color="000000"/>
+              <w:bottom w:val="single" w:sz="4" w:space="0" w:color="000000"/>
+              <w:right w:val="single" w:sz="4" w:space="0" w:color="000000"/>
+            </w:tcBorders>
+            <w:tcMar>
+              <w:top w:w="100" w:type="dxa"/>
+              <w:left w:w="100" w:type="dxa"/>
+              <w:bottom w:w="100" w:type="dxa"/>
+              <w:right w:w="100" w:type="dxa"/>
+            </w:tcMar>
+          </w:tcPr>
+          <w:p>
+            <w:r>
+              <w:t>24/02</w:t>
+            </w:r>
+          </w:p>
+        </w:tc>
+        <w:tc>
+          <w:tcPr>
+            <w:tcW w:w="0" w:type="auto"/>
+            <w:tcBorders>
+              <w:top w:val="single" w:sz="4" w:space="0" w:color="000000"/>
+              <w:left w:val="single" w:sz="4" w:space="0" w:color="000000"/>
+              <w:bottom w:val="single" w:sz="4" w:space="0" w:color="000000"/>
+              <w:right w:val="single" w:sz="4" w:space="0" w:color="000000"/>
+            </w:tcBorders>
+            <w:tcMar>
+              <w:top w:w="100" w:type="dxa"/>
+              <w:left w:w="100" w:type="dxa"/>
+              <w:bottom w:w="100" w:type="dxa"/>
+              <w:right w:w="100" w:type="dxa"/>
+            </w:tcMar>
+          </w:tcPr>
+          <w:p>
+            <w:r>
+              <w:t>4:30</w:t>
+            </w:r>
+          </w:p>
+        </w:tc>
+        <w:tc>
+          <w:tcPr>
+            <w:tcW w:w="0" w:type="auto"/>
+            <w:tcBorders>
+              <w:top w:val="single" w:sz="4" w:space="0" w:color="000000"/>
+              <w:left w:val="single" w:sz="4" w:space="0" w:color="000000"/>
+              <w:bottom w:val="single" w:sz="4" w:space="0" w:color="000000"/>
+              <w:right w:val="single" w:sz="4" w:space="0" w:color="000000"/>
+            </w:tcBorders>
+            <w:tcMar>
+              <w:top w:w="100" w:type="dxa"/>
+              <w:left w:w="100" w:type="dxa"/>
+              <w:bottom w:w="100" w:type="dxa"/>
+              <w:right w:w="100" w:type="dxa"/>
+            </w:tcMar>
+          </w:tcPr>
+          <w:p>
+            <w:r>
+              <w:t>5:00</w:t>
+            </w:r>
+          </w:p>
+        </w:tc>
+        <w:tc>
+          <w:tcPr>
+            <w:tcW w:w="0" w:type="auto"/>
+            <w:tcBorders>
+              <w:top w:val="single" w:sz="4" w:space="0" w:color="000000"/>
+              <w:left w:val="single" w:sz="4" w:space="0" w:color="000000"/>
+              <w:bottom w:val="single" w:sz="4" w:space="0" w:color="000000"/>
+              <w:right w:val="single" w:sz="4" w:space="0" w:color="000000"/>
+            </w:tcBorders>
+            <w:tcMar>
+              <w:top w:w="100" w:type="dxa"/>
+              <w:left w:w="100" w:type="dxa"/>
+              <w:bottom w:w="100" w:type="dxa"/>
+              <w:right w:w="100" w:type="dxa"/>
+            </w:tcMar>
+          </w:tcPr>
+          <w:p/>
+        </w:tc>
+        <w:tc>
+          <w:tcPr>
+            <w:tcW w:w="0" w:type="auto"/>
+            <w:tcBorders>
+              <w:top w:val="single" w:sz="4" w:space="0" w:color="000000"/>
+              <w:left w:val="single" w:sz="4" w:space="0" w:color="000000"/>
+              <w:bottom w:val="single" w:sz="4" w:space="0" w:color="000000"/>
+              <w:right w:val="single" w:sz="4" w:space="0" w:color="000000"/>
+            </w:tcBorders>
+            <w:tcMar>
+              <w:top w:w="100" w:type="dxa"/>
+              <w:left w:w="100" w:type="dxa"/>
+              <w:bottom w:w="100" w:type="dxa"/>
+              <w:right w:w="100" w:type="dxa"/>
+            </w:tcMar>
+          </w:tcPr>
+          <w:p>
+            <w:r>
+              <w:t xml:space="preserve">30 </w:t>
+            </w:r>
+            <w:proofErr w:type="spellStart"/>
+            <w:r>
+              <w:t>minutos</w:t>
+            </w:r>
+            <w:proofErr w:type="spellEnd"/>
+          </w:p>
+        </w:tc>
+        <w:tc>
+          <w:tcPr>
+            <w:tcW w:w="0" w:type="auto"/>
+            <w:tcBorders>
+              <w:top w:val="single" w:sz="4" w:space="0" w:color="000000"/>
+              <w:left w:val="single" w:sz="4" w:space="0" w:color="000000"/>
+              <w:bottom w:val="single" w:sz="4" w:space="0" w:color="000000"/>
+              <w:right w:val="single" w:sz="4" w:space="0" w:color="000000"/>
+            </w:tcBorders>
+            <w:tcMar>
+              <w:top w:w="100" w:type="dxa"/>
+              <w:left w:w="100" w:type="dxa"/>
+              <w:bottom w:w="100" w:type="dxa"/>
+              <w:right w:w="100" w:type="dxa"/>
+            </w:tcMar>
+          </w:tcPr>
+          <w:p/>
+        </w:tc>
+        <w:tc>
+          <w:tcPr>
+            <w:tcW w:w="0" w:type="auto"/>
+            <w:tcBorders>
+              <w:top w:val="single" w:sz="4" w:space="0" w:color="000000"/>
+              <w:left w:val="single" w:sz="4" w:space="0" w:color="000000"/>
+              <w:bottom w:val="single" w:sz="4" w:space="0" w:color="000000"/>
+              <w:right w:val="single" w:sz="4" w:space="0" w:color="000000"/>
+            </w:tcBorders>
+            <w:tcMar>
+              <w:top w:w="100" w:type="dxa"/>
+              <w:left w:w="100" w:type="dxa"/>
+              <w:bottom w:w="100" w:type="dxa"/>
+              <w:right w:w="100" w:type="dxa"/>
+            </w:tcMar>
+          </w:tcPr>
+          <w:p>
+            <w:pPr>
+              <w:rPr>
+                <w:lang w:val="af-ZA"/>
+              </w:rPr>
+            </w:pPr>
+            <w:proofErr w:type="spellStart"/>
+            <w:r>
+              <w:rPr>
+                <w:lang w:val="es-GT"/>
+              </w:rPr>
+              <w:t>Creaci</w:t>
+            </w:r>
+            <w:proofErr w:type="spellEnd"/>
+            <w:r>
+              <w:rPr>
+                <w:lang w:val="af-ZA"/>
+              </w:rPr>
+              <w:t>ón de listado de tareas por hacer</w:t>
+            </w:r>
           </w:p>
         </w:tc>
       </w:tr>
@@ -1618,6 +1962,7 @@
   <w:style w:type="character" w:default="1" w:styleId="Fuentedeprrafopredeter">
     <w:name w:val="Default Paragraph Font"/>
     <w:uiPriority w:val="1"/>
+    <w:semiHidden/>
     <w:unhideWhenUsed/>
   </w:style>
   <w:style w:type="table" w:default="1" w:styleId="Tablanormal">

</xml_diff>